<commit_message>
docs: add cash handover, split payment and voucher-only discount
- Orders store cashAmount/qrAmount/paidBy instead of paymentMethod;
  split cash + VietQR payment (FR-POS-14, UC46, BR-PAY-01..04)
- Shifts record opening/closing/expected cash and difference;
  cash handover at check-out and shift cash report (UC44, UC45)
- Payment only from served; takeaway pay-first removed (OI-01)
- Manual discount removed; vouchers are the only discount (OI-04)
- Add FR-POS-12/13 and audit fields cancelledBy, confirmedBy,
  confirmedAt, movement cost (OI-08, OI-09)
- Sync use case spec, task assignment, diagrams and mockups;
  add Vietnamese money-flow user stories

Co-Authored-By: Claude Opus 5.5 (1M context) <noreply@anthropic.com>
</commit_message>
<xml_diff>
--- a/docs/BrewBoss_Task_Assignment.docx
+++ b/docs/BrewBoss_Task_Assignment.docx
@@ -47,7 +47,7 @@
           <w:sz w:val="22"/>
           <w:szCs w:val="22"/>
         </w:rPr>
-        <w:t xml:space="preserve">Document version 1.0 — 23/09/2026</w:t>
+        <w:t xml:space="preserve">Document version 1.1 — 23/09/2026</w:t>
       </w:r>
     </w:p>
     <w:p>
@@ -63,7 +63,7 @@
           <w:sz w:val="22"/>
           <w:szCs w:val="22"/>
         </w:rPr>
-        <w:t xml:space="preserve">Source: BrewBoss Product Brief v0.1 (§13, §14) and BrewBoss Use Case Specifications v1.0</w:t>
+        <w:t xml:space="preserve">Source: BrewBoss Product Brief v0.1 (§13, §14) and BrewBoss Use Case Specifications v1.1</w:t>
       </w:r>
     </w:p>
     <w:p>
@@ -380,7 +380,7 @@
                 <w:sz w:val="20"/>
                 <w:szCs w:val="20"/>
               </w:rPr>
-              <w:t xml:space="preserve">UC01–UC06, UC29</w:t>
+              <w:t xml:space="preserve">UC01–UC06, UC29, UC44, UC45</w:t>
             </w:r>
           </w:p>
         </w:tc>
@@ -726,7 +726,7 @@
                 <w:sz w:val="20"/>
                 <w:szCs w:val="20"/>
               </w:rPr>
-              <w:t xml:space="preserve">UC19–UC28</w:t>
+              <w:t xml:space="preserve">UC19–UC28, UC46</w:t>
             </w:r>
           </w:p>
         </w:tc>
@@ -782,7 +782,7 @@
                 <w:sz w:val="20"/>
                 <w:szCs w:val="20"/>
               </w:rPr>
-              <w:t xml:space="preserve">Order domain (price, status machine, shortId), payment transaction, VietQR</w:t>
+              <w:t xml:space="preserve">Order domain (price, status machine, shortId), payment transaction (cashAmount, qrAmount, paidBy), VietQR, split payment</w:t>
             </w:r>
           </w:p>
         </w:tc>
@@ -1189,7 +1189,7 @@
           <w:sz w:val="22"/>
           <w:szCs w:val="22"/>
         </w:rPr>
-        <w:t xml:space="preserve">Change from brief §13: Table management (UC18, S12) moves from M3 to M4. M3 carries the heaviest logic (orders, payment transaction, discounts, most dialogs), while M4 already owns the table QR code. Revert if the team disagrees.</w:t>
+        <w:t xml:space="preserve">Change from brief §13: Table management (UC18, S12) moves from M3 to M4. M3 carries the heaviest logic (orders, payment transaction, vouchers, most dialogs), while M4 already owns the table QR code. Revert if the team disagrees.</w:t>
       </w:r>
     </w:p>
     <w:p>
@@ -2825,7 +2825,7 @@
                 <w:sz w:val="20"/>
                 <w:szCs w:val="20"/>
               </w:rPr>
-              <w:t xml:space="preserve">Shop settings screen (shop info, bank account for VietQR, lateOrderMinutes, loyalty rates)</w:t>
+              <w:t xml:space="preserve">Shop settings section of S22, Manager only (shop info, bank account for VietQR, lateOrderMinutes, loyalty rates)</w:t>
             </w:r>
           </w:p>
         </w:tc>
@@ -2853,7 +2853,7 @@
                 <w:sz w:val="20"/>
                 <w:szCs w:val="20"/>
               </w:rPr>
-              <w:t xml:space="preserve">UC29</w:t>
+              <w:t xml:space="preserve">UC29, FR-POS-13</w:t>
             </w:r>
           </w:p>
         </w:tc>
@@ -3171,7 +3171,7 @@
                 <w:sz w:val="20"/>
                 <w:szCs w:val="20"/>
               </w:rPr>
-              <w:t xml:space="preserve">My shift: check in / check out</w:t>
+              <w:t xml:space="preserve">My shift: check in (opening cash for cashier/manager) / check out</w:t>
             </w:r>
           </w:p>
         </w:tc>
@@ -3517,7 +3517,7 @@
                 <w:sz w:val="20"/>
                 <w:szCs w:val="20"/>
               </w:rPr>
-              <w:t xml:space="preserve">Unit tests BR-STAFF-01, BR-STAFF-02; widget tests Login, Staff form</w:t>
+              <w:t xml:space="preserve">Unit tests BR-STAFF-01..05 (expected cash, difference); widget tests Login, Staff form</w:t>
             </w:r>
           </w:p>
         </w:tc>
@@ -3803,6 +3803,352 @@
                 <w:szCs w:val="20"/>
               </w:rPr>
               <w:t xml:space="preserve">W7</w:t>
+            </w:r>
+          </w:p>
+        </w:tc>
+      </w:tr>
+      <w:tr>
+        <w:trPr>
+          <w:cantSplit/>
+        </w:trPr>
+        <w:tc>
+          <w:tcPr>
+            <w:tcW w:type="dxa" w:w="850"/>
+            <w:tcMar>
+              <w:top w:type="dxa" w:w="40"/>
+              <w:left w:type="dxa" w:w="90"/>
+              <w:bottom w:type="dxa" w:w="40"/>
+              <w:right w:type="dxa" w:w="90"/>
+            </w:tcMar>
+            <w:vAlign w:val="center"/>
+          </w:tcPr>
+          <w:p>
+            <w:pPr>
+              <w:spacing w:after="20" w:before="20"/>
+              <w:jc w:val="left"/>
+            </w:pPr>
+            <w:r>
+              <w:rPr>
+                <w:rFonts w:ascii="Times New Roman" w:cs="Times New Roman" w:eastAsia="Times New Roman" w:hAnsi="Times New Roman"/>
+                <w:b w:val="false"/>
+                <w:bCs w:val="false"/>
+                <w:sz w:val="20"/>
+                <w:szCs w:val="20"/>
+              </w:rPr>
+              <w:t xml:space="preserve">M1-14</w:t>
+            </w:r>
+          </w:p>
+        </w:tc>
+        <w:tc>
+          <w:tcPr>
+            <w:tcW w:type="dxa" w:w="3476"/>
+            <w:tcMar>
+              <w:top w:type="dxa" w:w="40"/>
+              <w:left w:type="dxa" w:w="90"/>
+              <w:bottom w:type="dxa" w:w="40"/>
+              <w:right w:type="dxa" w:w="90"/>
+            </w:tcMar>
+            <w:vAlign w:val="center"/>
+          </w:tcPr>
+          <w:p>
+            <w:pPr>
+              <w:spacing w:after="20" w:before="20"/>
+              <w:jc w:val="left"/>
+            </w:pPr>
+            <w:r>
+              <w:rPr>
+                <w:rFonts w:ascii="Times New Roman" w:cs="Times New Roman" w:eastAsia="Times New Roman" w:hAnsi="Times New Roman"/>
+                <w:b w:val="false"/>
+                <w:bCs w:val="false"/>
+                <w:sz w:val="20"/>
+                <w:szCs w:val="20"/>
+              </w:rPr>
+              <w:t xml:space="preserve">Cash handover at check-out: expected cash from paid orders, counted cash, difference + required note</w:t>
+            </w:r>
+          </w:p>
+        </w:tc>
+        <w:tc>
+          <w:tcPr>
+            <w:tcW w:type="dxa" w:w="1400"/>
+            <w:tcMar>
+              <w:top w:type="dxa" w:w="40"/>
+              <w:left w:type="dxa" w:w="90"/>
+              <w:bottom w:type="dxa" w:w="40"/>
+              <w:right w:type="dxa" w:w="90"/>
+            </w:tcMar>
+            <w:vAlign w:val="center"/>
+          </w:tcPr>
+          <w:p>
+            <w:pPr>
+              <w:spacing w:after="20" w:before="20"/>
+              <w:jc w:val="left"/>
+            </w:pPr>
+            <w:r>
+              <w:rPr>
+                <w:rFonts w:ascii="Times New Roman" w:cs="Times New Roman" w:eastAsia="Times New Roman" w:hAnsi="Times New Roman"/>
+                <w:b w:val="false"/>
+                <w:bCs w:val="false"/>
+                <w:sz w:val="20"/>
+                <w:szCs w:val="20"/>
+              </w:rPr>
+              <w:t xml:space="preserve">UC44, FR-STAFF-07</w:t>
+            </w:r>
+          </w:p>
+        </w:tc>
+        <w:tc>
+          <w:tcPr>
+            <w:tcW w:type="dxa" w:w="1300"/>
+            <w:tcMar>
+              <w:top w:type="dxa" w:w="40"/>
+              <w:left w:type="dxa" w:w="90"/>
+              <w:bottom w:type="dxa" w:w="40"/>
+              <w:right w:type="dxa" w:w="90"/>
+            </w:tcMar>
+            <w:vAlign w:val="center"/>
+          </w:tcPr>
+          <w:p>
+            <w:pPr>
+              <w:spacing w:after="20" w:before="20"/>
+              <w:jc w:val="left"/>
+            </w:pPr>
+            <w:r>
+              <w:rPr>
+                <w:rFonts w:ascii="Times New Roman" w:cs="Times New Roman" w:eastAsia="Times New Roman" w:hAnsi="Times New Roman"/>
+                <w:b w:val="false"/>
+                <w:bCs w:val="false"/>
+                <w:sz w:val="20"/>
+                <w:szCs w:val="20"/>
+              </w:rPr>
+              <w:t xml:space="preserve">S07</w:t>
+            </w:r>
+          </w:p>
+        </w:tc>
+        <w:tc>
+          <w:tcPr>
+            <w:tcW w:type="dxa" w:w="1000"/>
+            <w:tcMar>
+              <w:top w:type="dxa" w:w="40"/>
+              <w:left w:type="dxa" w:w="90"/>
+              <w:bottom w:type="dxa" w:w="40"/>
+              <w:right w:type="dxa" w:w="90"/>
+            </w:tcMar>
+            <w:vAlign w:val="center"/>
+          </w:tcPr>
+          <w:p>
+            <w:pPr>
+              <w:spacing w:after="20" w:before="20"/>
+              <w:jc w:val="left"/>
+            </w:pPr>
+            <w:r>
+              <w:rPr>
+                <w:rFonts w:ascii="Times New Roman" w:cs="Times New Roman" w:eastAsia="Times New Roman" w:hAnsi="Times New Roman"/>
+                <w:b w:val="false"/>
+                <w:bCs w:val="false"/>
+                <w:sz w:val="20"/>
+                <w:szCs w:val="20"/>
+              </w:rPr>
+              <w:t xml:space="preserve">P1</w:t>
+            </w:r>
+          </w:p>
+        </w:tc>
+        <w:tc>
+          <w:tcPr>
+            <w:tcW w:type="dxa" w:w="1000"/>
+            <w:tcMar>
+              <w:top w:type="dxa" w:w="40"/>
+              <w:left w:type="dxa" w:w="90"/>
+              <w:bottom w:type="dxa" w:w="40"/>
+              <w:right w:type="dxa" w:w="90"/>
+            </w:tcMar>
+            <w:vAlign w:val="center"/>
+          </w:tcPr>
+          <w:p>
+            <w:pPr>
+              <w:spacing w:after="20" w:before="20"/>
+              <w:jc w:val="left"/>
+            </w:pPr>
+            <w:r>
+              <w:rPr>
+                <w:rFonts w:ascii="Times New Roman" w:cs="Times New Roman" w:eastAsia="Times New Roman" w:hAnsi="Times New Roman"/>
+                <w:b w:val="false"/>
+                <w:bCs w:val="false"/>
+                <w:sz w:val="20"/>
+                <w:szCs w:val="20"/>
+              </w:rPr>
+              <w:t xml:space="preserve">W5</w:t>
+            </w:r>
+          </w:p>
+        </w:tc>
+      </w:tr>
+      <w:tr>
+        <w:trPr>
+          <w:cantSplit/>
+        </w:trPr>
+        <w:tc>
+          <w:tcPr>
+            <w:tcW w:type="dxa" w:w="850"/>
+            <w:tcMar>
+              <w:top w:type="dxa" w:w="40"/>
+              <w:left w:type="dxa" w:w="90"/>
+              <w:bottom w:type="dxa" w:w="40"/>
+              <w:right w:type="dxa" w:w="90"/>
+            </w:tcMar>
+            <w:vAlign w:val="center"/>
+          </w:tcPr>
+          <w:p>
+            <w:pPr>
+              <w:spacing w:after="20" w:before="20"/>
+              <w:jc w:val="left"/>
+            </w:pPr>
+            <w:r>
+              <w:rPr>
+                <w:rFonts w:ascii="Times New Roman" w:cs="Times New Roman" w:eastAsia="Times New Roman" w:hAnsi="Times New Roman"/>
+                <w:b w:val="false"/>
+                <w:bCs w:val="false"/>
+                <w:sz w:val="20"/>
+                <w:szCs w:val="20"/>
+              </w:rPr>
+              <w:t xml:space="preserve">M1-15</w:t>
+            </w:r>
+          </w:p>
+        </w:tc>
+        <w:tc>
+          <w:tcPr>
+            <w:tcW w:type="dxa" w:w="3476"/>
+            <w:tcMar>
+              <w:top w:type="dxa" w:w="40"/>
+              <w:left w:type="dxa" w:w="90"/>
+              <w:bottom w:type="dxa" w:w="40"/>
+              <w:right w:type="dxa" w:w="90"/>
+            </w:tcMar>
+            <w:vAlign w:val="center"/>
+          </w:tcPr>
+          <w:p>
+            <w:pPr>
+              <w:spacing w:after="20" w:before="20"/>
+              <w:jc w:val="left"/>
+            </w:pPr>
+            <w:r>
+              <w:rPr>
+                <w:rFonts w:ascii="Times New Roman" w:cs="Times New Roman" w:eastAsia="Times New Roman" w:hAnsi="Times New Roman"/>
+                <w:b w:val="false"/>
+                <w:bCs w:val="false"/>
+                <w:sz w:val="20"/>
+                <w:szCs w:val="20"/>
+              </w:rPr>
+              <w:t xml:space="preserve">Shift cash report: per-shift cash columns, "only with difference" filter, period totals</w:t>
+            </w:r>
+          </w:p>
+        </w:tc>
+        <w:tc>
+          <w:tcPr>
+            <w:tcW w:type="dxa" w:w="1400"/>
+            <w:tcMar>
+              <w:top w:type="dxa" w:w="40"/>
+              <w:left w:type="dxa" w:w="90"/>
+              <w:bottom w:type="dxa" w:w="40"/>
+              <w:right w:type="dxa" w:w="90"/>
+            </w:tcMar>
+            <w:vAlign w:val="center"/>
+          </w:tcPr>
+          <w:p>
+            <w:pPr>
+              <w:spacing w:after="20" w:before="20"/>
+              <w:jc w:val="left"/>
+            </w:pPr>
+            <w:r>
+              <w:rPr>
+                <w:rFonts w:ascii="Times New Roman" w:cs="Times New Roman" w:eastAsia="Times New Roman" w:hAnsi="Times New Roman"/>
+                <w:b w:val="false"/>
+                <w:bCs w:val="false"/>
+                <w:sz w:val="20"/>
+                <w:szCs w:val="20"/>
+              </w:rPr>
+              <w:t xml:space="preserve">UC45, FR-STAFF-08</w:t>
+            </w:r>
+          </w:p>
+        </w:tc>
+        <w:tc>
+          <w:tcPr>
+            <w:tcW w:type="dxa" w:w="1300"/>
+            <w:tcMar>
+              <w:top w:type="dxa" w:w="40"/>
+              <w:left w:type="dxa" w:w="90"/>
+              <w:bottom w:type="dxa" w:w="40"/>
+              <w:right w:type="dxa" w:w="90"/>
+            </w:tcMar>
+            <w:vAlign w:val="center"/>
+          </w:tcPr>
+          <w:p>
+            <w:pPr>
+              <w:spacing w:after="20" w:before="20"/>
+              <w:jc w:val="left"/>
+            </w:pPr>
+            <w:r>
+              <w:rPr>
+                <w:rFonts w:ascii="Times New Roman" w:cs="Times New Roman" w:eastAsia="Times New Roman" w:hAnsi="Times New Roman"/>
+                <w:b w:val="false"/>
+                <w:bCs w:val="false"/>
+                <w:sz w:val="20"/>
+                <w:szCs w:val="20"/>
+              </w:rPr>
+              <w:t xml:space="preserve">S06</w:t>
+            </w:r>
+          </w:p>
+        </w:tc>
+        <w:tc>
+          <w:tcPr>
+            <w:tcW w:type="dxa" w:w="1000"/>
+            <w:tcMar>
+              <w:top w:type="dxa" w:w="40"/>
+              <w:left w:type="dxa" w:w="90"/>
+              <w:bottom w:type="dxa" w:w="40"/>
+              <w:right w:type="dxa" w:w="90"/>
+            </w:tcMar>
+            <w:vAlign w:val="center"/>
+          </w:tcPr>
+          <w:p>
+            <w:pPr>
+              <w:spacing w:after="20" w:before="20"/>
+              <w:jc w:val="left"/>
+            </w:pPr>
+            <w:r>
+              <w:rPr>
+                <w:rFonts w:ascii="Times New Roman" w:cs="Times New Roman" w:eastAsia="Times New Roman" w:hAnsi="Times New Roman"/>
+                <w:b w:val="false"/>
+                <w:bCs w:val="false"/>
+                <w:sz w:val="20"/>
+                <w:szCs w:val="20"/>
+              </w:rPr>
+              <w:t xml:space="preserve">P1</w:t>
+            </w:r>
+          </w:p>
+        </w:tc>
+        <w:tc>
+          <w:tcPr>
+            <w:tcW w:type="dxa" w:w="1000"/>
+            <w:tcMar>
+              <w:top w:type="dxa" w:w="40"/>
+              <w:left w:type="dxa" w:w="90"/>
+              <w:bottom w:type="dxa" w:w="40"/>
+              <w:right w:type="dxa" w:w="90"/>
+            </w:tcMar>
+            <w:vAlign w:val="center"/>
+          </w:tcPr>
+          <w:p>
+            <w:pPr>
+              <w:spacing w:after="20" w:before="20"/>
+              <w:jc w:val="left"/>
+            </w:pPr>
+            <w:r>
+              <w:rPr>
+                <w:rFonts w:ascii="Times New Roman" w:cs="Times New Roman" w:eastAsia="Times New Roman" w:hAnsi="Times New Roman"/>
+                <w:b w:val="false"/>
+                <w:bCs w:val="false"/>
+                <w:sz w:val="20"/>
+                <w:szCs w:val="20"/>
+              </w:rPr>
+              <w:t xml:space="preserve">W6</w:t>
             </w:r>
           </w:p>
         </w:tc>
@@ -5305,7 +5651,7 @@
                 <w:sz w:val="20"/>
                 <w:szCs w:val="20"/>
               </w:rPr>
-              <w:t xml:space="preserve">Stock-in dialog and stock adjustment dialog (transaction + movement record)</w:t>
+              <w:t xml:space="preserve">Stock-in dialog (optional total cost) and stock adjustment dialog (transaction + movement record)</w:t>
             </w:r>
           </w:p>
         </w:tc>
@@ -7439,7 +7785,7 @@
                 <w:sz w:val="20"/>
                 <w:szCs w:val="20"/>
               </w:rPr>
-              <w:t xml:space="preserve">Mark order served; cancel order with reason (manager-only for preparing)</w:t>
+              <w:t xml:space="preserve">Mark order served (takeaway: when handed over); cancel order with reason and cancelledBy (manager-only for preparing)</w:t>
             </w:r>
           </w:p>
         </w:tc>
@@ -7467,7 +7813,7 @@
                 <w:sz w:val="20"/>
                 <w:szCs w:val="20"/>
               </w:rPr>
-              <w:t xml:space="preserve">UC23, UC27</w:t>
+              <w:t xml:space="preserve">UC23, UC27, FR-POS-12</w:t>
             </w:r>
           </w:p>
         </w:tc>
@@ -7612,7 +7958,7 @@
                 <w:sz w:val="20"/>
                 <w:szCs w:val="20"/>
               </w:rPr>
-              <w:t xml:space="preserve">Payment screen: cash, change due, single Firestore transaction</w:t>
+              <w:t xml:space="preserve">Payment screen: cash, change due, single Firestore transaction writing cashAmount, qrAmount, paidBy; open-shift check (BR-PAY-03)</w:t>
             </w:r>
           </w:p>
         </w:tc>
@@ -7785,7 +8131,7 @@
                 <w:sz w:val="20"/>
                 <w:szCs w:val="20"/>
               </w:rPr>
-              <w:t xml:space="preserve">Discount sheet: voucher validation, manual percent/fixed, &gt;20% manager rule</w:t>
+              <w:t xml:space="preserve">Voucher sheet: code entry, validation (active, expiry, usage limit, min order), max-discount cap; no manual discount (BR-DIS-03)</w:t>
             </w:r>
           </w:p>
         </w:tc>
@@ -8304,7 +8650,7 @@
                 <w:sz w:val="20"/>
                 <w:szCs w:val="20"/>
               </w:rPr>
-              <w:t xml:space="preserve">Confirm customer order (re-validate prices)</w:t>
+              <w:t xml:space="preserve">Confirm customer order (re-validate prices, set confirmedBy / confirmedAt)</w:t>
             </w:r>
           </w:p>
         </w:tc>
@@ -8823,7 +9169,7 @@
                 <w:sz w:val="20"/>
                 <w:szCs w:val="20"/>
               </w:rPr>
-              <w:t xml:space="preserve">Unit tests BR-ORD-*, BR-DIS-*; repository tests with fake_cloud_firestore</w:t>
+              <w:t xml:space="preserve">Unit tests BR-ORD-*, BR-DIS-*, BR-PAY-*; repository tests with fake_cloud_firestore</w:t>
             </w:r>
           </w:p>
         </w:tc>
@@ -8851,7 +9197,7 @@
                 <w:sz w:val="20"/>
                 <w:szCs w:val="20"/>
               </w:rPr>
-              <w:t xml:space="preserve">BR-ORD-*, BR-DIS-*</w:t>
+              <w:t xml:space="preserve">BR-ORD-*, BR-DIS-*, BR-PAY-*</w:t>
             </w:r>
           </w:p>
         </w:tc>
@@ -8936,6 +9282,179 @@
                 <w:szCs w:val="20"/>
               </w:rPr>
               <w:t xml:space="preserve">W7</w:t>
+            </w:r>
+          </w:p>
+        </w:tc>
+      </w:tr>
+      <w:tr>
+        <w:trPr>
+          <w:cantSplit/>
+        </w:trPr>
+        <w:tc>
+          <w:tcPr>
+            <w:tcW w:type="dxa" w:w="850"/>
+            <w:tcMar>
+              <w:top w:type="dxa" w:w="40"/>
+              <w:left w:type="dxa" w:w="90"/>
+              <w:bottom w:type="dxa" w:w="40"/>
+              <w:right w:type="dxa" w:w="90"/>
+            </w:tcMar>
+            <w:vAlign w:val="center"/>
+          </w:tcPr>
+          <w:p>
+            <w:pPr>
+              <w:spacing w:after="20" w:before="20"/>
+              <w:jc w:val="left"/>
+            </w:pPr>
+            <w:r>
+              <w:rPr>
+                <w:rFonts w:ascii="Times New Roman" w:cs="Times New Roman" w:eastAsia="Times New Roman" w:hAnsi="Times New Roman"/>
+                <w:b w:val="false"/>
+                <w:bCs w:val="false"/>
+                <w:sz w:val="20"/>
+                <w:szCs w:val="20"/>
+              </w:rPr>
+              <w:t xml:space="preserve">M3-15</w:t>
+            </w:r>
+          </w:p>
+        </w:tc>
+        <w:tc>
+          <w:tcPr>
+            <w:tcW w:type="dxa" w:w="3476"/>
+            <w:tcMar>
+              <w:top w:type="dxa" w:w="40"/>
+              <w:left w:type="dxa" w:w="90"/>
+              <w:bottom w:type="dxa" w:w="40"/>
+              <w:right w:type="dxa" w:w="90"/>
+            </w:tcMar>
+            <w:vAlign w:val="center"/>
+          </w:tcPr>
+          <w:p>
+            <w:pPr>
+              <w:spacing w:after="20" w:before="20"/>
+              <w:jc w:val="left"/>
+            </w:pPr>
+            <w:r>
+              <w:rPr>
+                <w:rFonts w:ascii="Times New Roman" w:cs="Times New Roman" w:eastAsia="Times New Roman" w:hAnsi="Times New Roman"/>
+                <w:b w:val="false"/>
+                <w:bCs w:val="false"/>
+                <w:sz w:val="20"/>
+                <w:szCs w:val="20"/>
+              </w:rPr>
+              <w:t xml:space="preserve">Split payment cash + VietQR (QR shows only the transfer part, change on the cash part)</w:t>
+            </w:r>
+          </w:p>
+        </w:tc>
+        <w:tc>
+          <w:tcPr>
+            <w:tcW w:type="dxa" w:w="1400"/>
+            <w:tcMar>
+              <w:top w:type="dxa" w:w="40"/>
+              <w:left w:type="dxa" w:w="90"/>
+              <w:bottom w:type="dxa" w:w="40"/>
+              <w:right w:type="dxa" w:w="90"/>
+            </w:tcMar>
+            <w:vAlign w:val="center"/>
+          </w:tcPr>
+          <w:p>
+            <w:pPr>
+              <w:spacing w:after="20" w:before="20"/>
+              <w:jc w:val="left"/>
+            </w:pPr>
+            <w:r>
+              <w:rPr>
+                <w:rFonts w:ascii="Times New Roman" w:cs="Times New Roman" w:eastAsia="Times New Roman" w:hAnsi="Times New Roman"/>
+                <w:b w:val="false"/>
+                <w:bCs w:val="false"/>
+                <w:sz w:val="20"/>
+                <w:szCs w:val="20"/>
+              </w:rPr>
+              <w:t xml:space="preserve">UC46, FR-POS-14</w:t>
+            </w:r>
+          </w:p>
+        </w:tc>
+        <w:tc>
+          <w:tcPr>
+            <w:tcW w:type="dxa" w:w="1300"/>
+            <w:tcMar>
+              <w:top w:type="dxa" w:w="40"/>
+              <w:left w:type="dxa" w:w="90"/>
+              <w:bottom w:type="dxa" w:w="40"/>
+              <w:right w:type="dxa" w:w="90"/>
+            </w:tcMar>
+            <w:vAlign w:val="center"/>
+          </w:tcPr>
+          <w:p>
+            <w:pPr>
+              <w:spacing w:after="20" w:before="20"/>
+              <w:jc w:val="left"/>
+            </w:pPr>
+            <w:r>
+              <w:rPr>
+                <w:rFonts w:ascii="Times New Roman" w:cs="Times New Roman" w:eastAsia="Times New Roman" w:hAnsi="Times New Roman"/>
+                <w:b w:val="false"/>
+                <w:bCs w:val="false"/>
+                <w:sz w:val="20"/>
+                <w:szCs w:val="20"/>
+              </w:rPr>
+              <w:t xml:space="preserve">S15</w:t>
+            </w:r>
+          </w:p>
+        </w:tc>
+        <w:tc>
+          <w:tcPr>
+            <w:tcW w:type="dxa" w:w="1000"/>
+            <w:tcMar>
+              <w:top w:type="dxa" w:w="40"/>
+              <w:left w:type="dxa" w:w="90"/>
+              <w:bottom w:type="dxa" w:w="40"/>
+              <w:right w:type="dxa" w:w="90"/>
+            </w:tcMar>
+            <w:vAlign w:val="center"/>
+          </w:tcPr>
+          <w:p>
+            <w:pPr>
+              <w:spacing w:after="20" w:before="20"/>
+              <w:jc w:val="left"/>
+            </w:pPr>
+            <w:r>
+              <w:rPr>
+                <w:rFonts w:ascii="Times New Roman" w:cs="Times New Roman" w:eastAsia="Times New Roman" w:hAnsi="Times New Roman"/>
+                <w:b w:val="false"/>
+                <w:bCs w:val="false"/>
+                <w:sz w:val="20"/>
+                <w:szCs w:val="20"/>
+              </w:rPr>
+              <w:t xml:space="preserve">P1</w:t>
+            </w:r>
+          </w:p>
+        </w:tc>
+        <w:tc>
+          <w:tcPr>
+            <w:tcW w:type="dxa" w:w="1000"/>
+            <w:tcMar>
+              <w:top w:type="dxa" w:w="40"/>
+              <w:left w:type="dxa" w:w="90"/>
+              <w:bottom w:type="dxa" w:w="40"/>
+              <w:right w:type="dxa" w:w="90"/>
+            </w:tcMar>
+            <w:vAlign w:val="center"/>
+          </w:tcPr>
+          <w:p>
+            <w:pPr>
+              <w:spacing w:after="20" w:before="20"/>
+              <w:jc w:val="left"/>
+            </w:pPr>
+            <w:r>
+              <w:rPr>
+                <w:rFonts w:ascii="Times New Roman" w:cs="Times New Roman" w:eastAsia="Times New Roman" w:hAnsi="Times New Roman"/>
+                <w:b w:val="false"/>
+                <w:bCs w:val="false"/>
+                <w:sz w:val="20"/>
+                <w:szCs w:val="20"/>
+              </w:rPr>
+              <w:t xml:space="preserve">W6</w:t>
             </w:r>
           </w:p>
         </w:tc>
@@ -12226,7 +12745,7 @@
                 <w:sz w:val="20"/>
                 <w:szCs w:val="20"/>
               </w:rPr>
-              <w:t xml:space="preserve">Reports: revenue chart, top products, payment split (fl_chart)</w:t>
+              <w:t xml:space="preserve">Reports: revenue chart, top products, payment split Σ cashAmount vs Σ qrAmount (fl_chart)</w:t>
             </w:r>
           </w:p>
         </w:tc>
@@ -14134,6 +14653,240 @@
                 <w:sz w:val="20"/>
                 <w:szCs w:val="20"/>
               </w:rPr>
+              <w:t xml:space="preserve">M3</w:t>
+            </w:r>
+          </w:p>
+        </w:tc>
+        <w:tc>
+          <w:tcPr>
+            <w:tcW w:type="dxa" w:w="3226"/>
+            <w:tcMar>
+              <w:top w:type="dxa" w:w="40"/>
+              <w:left w:type="dxa" w:w="90"/>
+              <w:bottom w:type="dxa" w:w="40"/>
+              <w:right w:type="dxa" w:w="90"/>
+            </w:tcMar>
+            <w:vAlign w:val="center"/>
+          </w:tcPr>
+          <w:p>
+            <w:pPr>
+              <w:spacing w:after="20" w:before="20"/>
+              <w:jc w:val="left"/>
+            </w:pPr>
+            <w:r>
+              <w:rPr>
+                <w:rFonts w:ascii="Times New Roman" w:cs="Times New Roman" w:eastAsia="Times New Roman" w:hAnsi="Times New Roman"/>
+                <w:b w:val="false"/>
+                <w:bCs w:val="false"/>
+                <w:sz w:val="20"/>
+                <w:szCs w:val="20"/>
+              </w:rPr>
+              <w:t xml:space="preserve">Payment writes cashAmount, qrAmount, paidBy</w:t>
+            </w:r>
+          </w:p>
+        </w:tc>
+        <w:tc>
+          <w:tcPr>
+            <w:tcW w:type="dxa" w:w="3500"/>
+            <w:tcMar>
+              <w:top w:type="dxa" w:w="40"/>
+              <w:left w:type="dxa" w:w="90"/>
+              <w:bottom w:type="dxa" w:w="40"/>
+              <w:right w:type="dxa" w:w="90"/>
+            </w:tcMar>
+            <w:vAlign w:val="center"/>
+          </w:tcPr>
+          <w:p>
+            <w:pPr>
+              <w:spacing w:after="20" w:before="20"/>
+              <w:jc w:val="left"/>
+            </w:pPr>
+            <w:r>
+              <w:rPr>
+                <w:rFonts w:ascii="Times New Roman" w:cs="Times New Roman" w:eastAsia="Times New Roman" w:hAnsi="Times New Roman"/>
+                <w:b w:val="false"/>
+                <w:bCs w:val="false"/>
+                <w:sz w:val="20"/>
+                <w:szCs w:val="20"/>
+              </w:rPr>
+              <w:t xml:space="preserve">M1 (cash handover), M5 (reports)</w:t>
+            </w:r>
+          </w:p>
+        </w:tc>
+        <w:tc>
+          <w:tcPr>
+            <w:tcW w:type="dxa" w:w="1500"/>
+            <w:tcMar>
+              <w:top w:type="dxa" w:w="40"/>
+              <w:left w:type="dxa" w:w="90"/>
+              <w:bottom w:type="dxa" w:w="40"/>
+              <w:right w:type="dxa" w:w="90"/>
+            </w:tcMar>
+            <w:vAlign w:val="center"/>
+          </w:tcPr>
+          <w:p>
+            <w:pPr>
+              <w:spacing w:after="20" w:before="20"/>
+              <w:jc w:val="left"/>
+            </w:pPr>
+            <w:r>
+              <w:rPr>
+                <w:rFonts w:ascii="Times New Roman" w:cs="Times New Roman" w:eastAsia="Times New Roman" w:hAnsi="Times New Roman"/>
+                <w:b w:val="false"/>
+                <w:bCs w:val="false"/>
+                <w:sz w:val="20"/>
+                <w:szCs w:val="20"/>
+              </w:rPr>
+              <w:t xml:space="preserve">W4</w:t>
+            </w:r>
+          </w:p>
+        </w:tc>
+      </w:tr>
+      <w:tr>
+        <w:trPr>
+          <w:cantSplit/>
+        </w:trPr>
+        <w:tc>
+          <w:tcPr>
+            <w:tcW w:type="dxa" w:w="800"/>
+            <w:tcMar>
+              <w:top w:type="dxa" w:w="40"/>
+              <w:left w:type="dxa" w:w="90"/>
+              <w:bottom w:type="dxa" w:w="40"/>
+              <w:right w:type="dxa" w:w="90"/>
+            </w:tcMar>
+            <w:vAlign w:val="center"/>
+          </w:tcPr>
+          <w:p>
+            <w:pPr>
+              <w:spacing w:after="20" w:before="20"/>
+              <w:jc w:val="left"/>
+            </w:pPr>
+            <w:r>
+              <w:rPr>
+                <w:rFonts w:ascii="Times New Roman" w:cs="Times New Roman" w:eastAsia="Times New Roman" w:hAnsi="Times New Roman"/>
+                <w:b w:val="false"/>
+                <w:bCs w:val="false"/>
+                <w:sz w:val="20"/>
+                <w:szCs w:val="20"/>
+              </w:rPr>
+              <w:t xml:space="preserve">M1</w:t>
+            </w:r>
+          </w:p>
+        </w:tc>
+        <w:tc>
+          <w:tcPr>
+            <w:tcW w:type="dxa" w:w="3226"/>
+            <w:tcMar>
+              <w:top w:type="dxa" w:w="40"/>
+              <w:left w:type="dxa" w:w="90"/>
+              <w:bottom w:type="dxa" w:w="40"/>
+              <w:right w:type="dxa" w:w="90"/>
+            </w:tcMar>
+            <w:vAlign w:val="center"/>
+          </w:tcPr>
+          <w:p>
+            <w:pPr>
+              <w:spacing w:after="20" w:before="20"/>
+              <w:jc w:val="left"/>
+            </w:pPr>
+            <w:r>
+              <w:rPr>
+                <w:rFonts w:ascii="Times New Roman" w:cs="Times New Roman" w:eastAsia="Times New Roman" w:hAnsi="Times New Roman"/>
+                <w:b w:val="false"/>
+                <w:bCs w:val="false"/>
+                <w:sz w:val="20"/>
+                <w:szCs w:val="20"/>
+              </w:rPr>
+              <w:t xml:space="preserve">Open-shift provider (BR-PAY-03)</w:t>
+            </w:r>
+          </w:p>
+        </w:tc>
+        <w:tc>
+          <w:tcPr>
+            <w:tcW w:type="dxa" w:w="3500"/>
+            <w:tcMar>
+              <w:top w:type="dxa" w:w="40"/>
+              <w:left w:type="dxa" w:w="90"/>
+              <w:bottom w:type="dxa" w:w="40"/>
+              <w:right w:type="dxa" w:w="90"/>
+            </w:tcMar>
+            <w:vAlign w:val="center"/>
+          </w:tcPr>
+          <w:p>
+            <w:pPr>
+              <w:spacing w:after="20" w:before="20"/>
+              <w:jc w:val="left"/>
+            </w:pPr>
+            <w:r>
+              <w:rPr>
+                <w:rFonts w:ascii="Times New Roman" w:cs="Times New Roman" w:eastAsia="Times New Roman" w:hAnsi="Times New Roman"/>
+                <w:b w:val="false"/>
+                <w:bCs w:val="false"/>
+                <w:sz w:val="20"/>
+                <w:szCs w:val="20"/>
+              </w:rPr>
+              <w:t xml:space="preserve">M3 (payment transaction)</w:t>
+            </w:r>
+          </w:p>
+        </w:tc>
+        <w:tc>
+          <w:tcPr>
+            <w:tcW w:type="dxa" w:w="1500"/>
+            <w:tcMar>
+              <w:top w:type="dxa" w:w="40"/>
+              <w:left w:type="dxa" w:w="90"/>
+              <w:bottom w:type="dxa" w:w="40"/>
+              <w:right w:type="dxa" w:w="90"/>
+            </w:tcMar>
+            <w:vAlign w:val="center"/>
+          </w:tcPr>
+          <w:p>
+            <w:pPr>
+              <w:spacing w:after="20" w:before="20"/>
+              <w:jc w:val="left"/>
+            </w:pPr>
+            <w:r>
+              <w:rPr>
+                <w:rFonts w:ascii="Times New Roman" w:cs="Times New Roman" w:eastAsia="Times New Roman" w:hAnsi="Times New Roman"/>
+                <w:b w:val="false"/>
+                <w:bCs w:val="false"/>
+                <w:sz w:val="20"/>
+                <w:szCs w:val="20"/>
+              </w:rPr>
+              <w:t xml:space="preserve">W5</w:t>
+            </w:r>
+          </w:p>
+        </w:tc>
+      </w:tr>
+      <w:tr>
+        <w:trPr>
+          <w:cantSplit/>
+        </w:trPr>
+        <w:tc>
+          <w:tcPr>
+            <w:tcW w:type="dxa" w:w="800"/>
+            <w:tcMar>
+              <w:top w:type="dxa" w:w="40"/>
+              <w:left w:type="dxa" w:w="90"/>
+              <w:bottom w:type="dxa" w:w="40"/>
+              <w:right w:type="dxa" w:w="90"/>
+            </w:tcMar>
+            <w:vAlign w:val="center"/>
+          </w:tcPr>
+          <w:p>
+            <w:pPr>
+              <w:spacing w:after="20" w:before="20"/>
+              <w:jc w:val="left"/>
+            </w:pPr>
+            <w:r>
+              <w:rPr>
+                <w:rFonts w:ascii="Times New Roman" w:cs="Times New Roman" w:eastAsia="Times New Roman" w:hAnsi="Times New Roman"/>
+                <w:b w:val="false"/>
+                <w:bCs w:val="false"/>
+                <w:sz w:val="20"/>
+                <w:szCs w:val="20"/>
+              </w:rPr>
               <w:t xml:space="preserve">M5</w:t>
             </w:r>
           </w:p>
@@ -15202,7 +15955,7 @@
                 <w:sz w:val="20"/>
                 <w:szCs w:val="20"/>
               </w:rPr>
-              <w:t xml:space="preserve">Forgot password, my shift</w:t>
+              <w:t xml:space="preserve">Forgot password, my shift, cash handover</w:t>
             </w:r>
           </w:p>
         </w:tc>
@@ -15258,7 +16011,7 @@
                 <w:sz w:val="20"/>
                 <w:szCs w:val="20"/>
               </w:rPr>
-              <w:t xml:space="preserve">Discounts, integrate stock + points</w:t>
+              <w:t xml:space="preserve">Vouchers, integrate stock + points</w:t>
             </w:r>
           </w:p>
         </w:tc>
@@ -15375,7 +16128,7 @@
                 <w:sz w:val="20"/>
                 <w:szCs w:val="20"/>
               </w:rPr>
-              <w:t xml:space="preserve">Shift history</w:t>
+              <w:t xml:space="preserve">Shift history, shift cash report</w:t>
             </w:r>
           </w:p>
         </w:tc>
@@ -15431,7 +16184,7 @@
                 <w:sz w:val="20"/>
                 <w:szCs w:val="20"/>
               </w:rPr>
-              <w:t xml:space="preserve">VietQR, confirm, move/merge</w:t>
+              <w:t xml:space="preserve">VietQR, split payment, confirm, move/merge</w:t>
             </w:r>
           </w:p>
         </w:tc>

</xml_diff>

<commit_message>
docs: name M4 member and add SDS design
Assign M4 (MENU, INV) to Lai Huu Quang Anh (HE190282) in the task
assignment, use case specifications, SRS and product brief.

Fill sds_prm.docx from the FPT template: architecture, process, logical,
development and deployment views, common design, per-module class and
screen design, sequence diagrams SD-01..SD-13 and the Firestore design.
Figures come from docs/diagrams/sds-diagrams.drawio.

Co-Authored-By: Claude Opus 5.5 <noreply@anthropic.com>
</commit_message>
<xml_diff>
--- a/docs/BrewBoss_Task_Assignment.docx
+++ b/docs/BrewBoss_Task_Assignment.docx
@@ -47,7 +47,7 @@
           <w:sz w:val="22"/>
           <w:szCs w:val="22"/>
         </w:rPr>
-        <w:t xml:space="preserve">Document version 1.2 — 28/09/2026</w:t>
+        <w:t>Document version 1.3 — 28/09/2026</w:t>
       </w:r>
     </w:p>
     <w:p>
@@ -63,7 +63,7 @@
           <w:sz w:val="22"/>
           <w:szCs w:val="22"/>
         </w:rPr>
-        <w:t xml:space="preserve">Source: BrewBoss Product Brief v0.1 (§13, §14) and BrewBoss Use Case Specifications v1.1</w:t>
+        <w:t>Source: BrewBoss Product Brief v0.1 (§13, §14) and BrewBoss Use Case Specifications v1.2</w:t>
       </w:r>
     </w:p>
     <w:p>
@@ -78,7 +78,7 @@
           <w:sz w:val="22"/>
           <w:szCs w:val="22"/>
         </w:rPr>
-        <w:t xml:space="preserve">This document assigns every use case, screen and shared technical task to one of the four member slots (M1–M4); M4 is not assigned yet. Each member owns a vertical slice (UI → state → repository → Security Rules → tests) for their modules. Weeks follow the 8-week plan in brief §14.</w:t>
+        <w:t>This document assigns every use case, screen and shared technical task to one of the four member slots (M1–M4) — M1 Trần Ngọc Huy, M2 Phạm Khắc Nghĩa, M3 Nguyễn Bá Cường, M4 Lại Hữu Quang Anh (HE190282). Each member owns a vertical slice (UI → state → repository → Security Rules → tests) for their modules. Weeks follow the 8-week plan in brief §14.</w:t>
       </w:r>
     </w:p>
     <w:p>
@@ -843,7 +843,7 @@
                 <w:sz w:val="20"/>
                 <w:szCs w:val="20"/>
               </w:rPr>
-              <w:t xml:space="preserve">M4 – unassigned</w:t>
+              <w:t>M4 – Lại Hữu Quang Anh</w:t>
             </w:r>
           </w:p>
         </w:tc>
@@ -10526,7 +10526,7 @@
           <w:sz w:val="24"/>
           <w:szCs w:val="24"/>
         </w:rPr>
-        <w:t xml:space="preserve">M4 – unassigned: MENU, INV + shared models</w:t>
+        <w:t>M4 – Lại Hữu Quang Anh: MENU, INV + shared models</w:t>
       </w:r>
     </w:p>
     <w:tbl>

</xml_diff>